<commit_message>
experiments: figuras ULB beeswarm transformado, script generate_shap | docs: FIGURAS_ULB_TFM, convenciones ML | sesion 10, solicitud tema TFT
</commit_message>
<xml_diff>
--- a/INFORMACIÓN GENERAL/P11_06_F07b Solicitud cambio tema TFT_v02.docx
+++ b/INFORMACIÓN GENERAL/P11_06_F07b Solicitud cambio tema TFT_v02.docx
@@ -144,7 +144,6 @@
           <w:placeholder>
             <w:docPart w:val="0B30705D4C3142919F9414281A8320C5"/>
           </w:placeholder>
-          <w:showingPlcHdr/>
           <w:text/>
         </w:sdtPr>
         <w:sdtEndPr>
@@ -158,10 +157,9 @@
         <w:sdtContent>
           <w:r>
             <w:rPr>
-              <w:rStyle w:val="Textodelmarcadordeposicin"/>
-              <w:sz w:val="20"/>
+              <w:rStyle w:val="Estilo1"/>
             </w:rPr>
-            <w:t>Nombre del estudiante</w:t>
+            <w:t>SERGIO MOYA MARÍN</w:t>
           </w:r>
         </w:sdtContent>
       </w:sdt>
@@ -196,31 +194,14 @@
           <w:placeholder>
             <w:docPart w:val="6EAB57B7FD684FE99A851C3B6B05105A"/>
           </w:placeholder>
-          <w:showingPlcHdr/>
           <w:text/>
         </w:sdtPr>
-        <w:sdtEndPr>
-          <w:rPr>
-            <w:rStyle w:val="Fuentedeprrafopredeter"/>
-            <w:rFonts w:ascii="Arial" w:eastAsia="Times New Roman" w:hAnsi="Arial" w:cs="Arial"/>
-            <w:sz w:val="22"/>
-            <w:lang w:eastAsia="es-ES"/>
-          </w:rPr>
-        </w:sdtEndPr>
         <w:sdtContent>
           <w:r>
             <w:rPr>
-              <w:rStyle w:val="Textodelmarcadordeposicin"/>
-              <w:sz w:val="20"/>
+              <w:rStyle w:val="Estilo1"/>
             </w:rPr>
-            <w:t>Programa de Estudios</w:t>
-          </w:r>
-          <w:r>
-            <w:rPr>
-              <w:rStyle w:val="Textodelmarcadordeposicin"/>
-              <w:sz w:val="20"/>
-            </w:rPr>
-            <w:t>.</w:t>
+            <w:t>Máster en Ingeniería de Tecnologías Industriales</w:t>
           </w:r>
         </w:sdtContent>
       </w:sdt>
@@ -257,24 +238,14 @@
           <w:placeholder>
             <w:docPart w:val="45CF427A1B604B78BFE14F48B65F9C20"/>
           </w:placeholder>
-          <w:showingPlcHdr/>
           <w:text/>
         </w:sdtPr>
-        <w:sdtEndPr>
-          <w:rPr>
-            <w:rStyle w:val="Fuentedeprrafopredeter"/>
-            <w:rFonts w:ascii="Arial" w:eastAsia="Times New Roman" w:hAnsi="Arial" w:cs="Arial"/>
-            <w:sz w:val="22"/>
-            <w:lang w:eastAsia="es-ES"/>
-          </w:rPr>
-        </w:sdtEndPr>
         <w:sdtContent>
           <w:r>
             <w:rPr>
-              <w:rStyle w:val="Textodelmarcadordeposicin"/>
-              <w:sz w:val="20"/>
+              <w:rStyle w:val="Estilo1"/>
             </w:rPr>
-            <w:t>Curso académico</w:t>
+            <w:t>2025-2026</w:t>
           </w:r>
         </w:sdtContent>
       </w:sdt>
@@ -303,30 +274,22 @@
       <w:sdt>
         <w:sdtPr>
           <w:rPr>
-            <w:rStyle w:val="Estilo1"/>
+            <w:rStyle w:val="Hipervnculo"/>
+            <w:sz w:val="20"/>
           </w:rPr>
           <w:id w:val="572777210"/>
           <w:placeholder>
             <w:docPart w:val="9E9AA8A9DF5F4693BE2DBF697DC1F362"/>
           </w:placeholder>
-          <w:showingPlcHdr/>
           <w:text/>
         </w:sdtPr>
-        <w:sdtEndPr>
-          <w:rPr>
-            <w:rStyle w:val="Fuentedeprrafopredeter"/>
-            <w:rFonts w:ascii="Arial" w:eastAsia="Times New Roman" w:hAnsi="Arial" w:cs="Arial"/>
-            <w:sz w:val="22"/>
-            <w:lang w:eastAsia="es-ES"/>
-          </w:rPr>
-        </w:sdtEndPr>
         <w:sdtContent>
           <w:r>
             <w:rPr>
-              <w:rStyle w:val="Textodelmarcadordeposicin"/>
+              <w:rStyle w:val="Hipervnculo"/>
               <w:sz w:val="20"/>
             </w:rPr>
-            <w:t>Correo electrónico</w:t>
+            <w:t>smoyam@student.universidadviu.com</w:t>
           </w:r>
         </w:sdtContent>
       </w:sdt>
@@ -362,8 +325,7 @@
           <w:placeholder>
             <w:docPart w:val="8A9929837DB64072881D83A9FF0E903F"/>
           </w:placeholder>
-          <w:showingPlcHdr/>
-          <w:date>
+          <w:date w:fullDate="2026-03-19T00:00:00Z">
             <w:dateFormat w:val="dd/MM/yyyy"/>
             <w:lid w:val="es-ES"/>
             <w:storeMappedDataAs w:val="dateTime"/>
@@ -373,17 +335,10 @@
         <w:sdtContent>
           <w:r>
             <w:rPr>
-              <w:rStyle w:val="Textodelmarcadordeposicin"/>
-              <w:sz w:val="20"/>
+              <w:rFonts w:ascii="Arial" w:eastAsia="Times New Roman" w:hAnsi="Arial" w:cs="Arial"/>
+              <w:lang w:eastAsia="es-ES"/>
             </w:rPr>
-            <w:t>Fecha de Solicitud</w:t>
-          </w:r>
-          <w:r>
-            <w:rPr>
-              <w:rStyle w:val="Textodelmarcadordeposicin"/>
-              <w:sz w:val="20"/>
-            </w:rPr>
-            <w:t>.</w:t>
+            <w:t>19/03/2026</w:t>
           </w:r>
         </w:sdtContent>
       </w:sdt>
@@ -490,24 +445,68 @@
           <w:placeholder>
             <w:docPart w:val="DD8ECC60B6F54B24B4C447050F55A5A5"/>
           </w:placeholder>
-          <w:showingPlcHdr/>
           <w:text/>
         </w:sdtPr>
-        <w:sdtEndPr>
-          <w:rPr>
-            <w:rStyle w:val="Fuentedeprrafopredeter"/>
-            <w:rFonts w:ascii="Arial" w:eastAsia="Times New Roman" w:hAnsi="Arial" w:cs="Arial"/>
-            <w:sz w:val="22"/>
-            <w:lang w:eastAsia="es-ES"/>
-          </w:rPr>
-        </w:sdtEndPr>
         <w:sdtContent>
           <w:r>
             <w:rPr>
-              <w:rStyle w:val="Textodelmarcadordeposicin"/>
-              <w:sz w:val="20"/>
+              <w:rStyle w:val="Estilo1"/>
             </w:rPr>
-            <w:t>Haga clic o pulse aquí para escribir texto.</w:t>
+            <w:t xml:space="preserve">El presente cambio de título responde a la necesidad de adecuar la nomenclatura del Trabajo Fin de Máster a la evolución real y el alcance definitivo de la </w:t>
+          </w:r>
+          <w:proofErr w:type="spellStart"/>
+          <w:r>
+            <w:rPr>
+              <w:rStyle w:val="Estilo1"/>
+            </w:rPr>
+            <w:t>investigación.El</w:t>
+          </w:r>
+          <w:proofErr w:type="spellEnd"/>
+          <w:r>
+            <w:rPr>
+              <w:rStyle w:val="Estilo1"/>
+            </w:rPr>
+            <w:t xml:space="preserve"> título inicialmente propuesto y aprobado en el primer entregable ("Aplicación de Técnicas de Aprendizaje Automático para la Detección de Transacciones Anómalas en Operaciones Financieras") planteaba un enfoque de carácter generalista. Sin embargo, conforme avanzó la fase experimental, el proyecto maduró y se especializó en resolver problemáticas operativas muy concretas del sector bancario. Específicamente, el núcleo de la investigación pivotó hacia la corrección de sesgos de validación, la gestión del desbalance extremo de clases y, de manera crítica, la operacionalización de Inteligencia Artificial Explicable (XAI) para satisfacer los requisitos regulatorios de transparencia </w:t>
+          </w:r>
+          <w:proofErr w:type="spellStart"/>
+          <w:r>
+            <w:rPr>
+              <w:rStyle w:val="Estilo1"/>
+            </w:rPr>
+            <w:t>algorítmica.Por</w:t>
+          </w:r>
+          <w:proofErr w:type="spellEnd"/>
+          <w:r>
+            <w:rPr>
+              <w:rStyle w:val="Estilo1"/>
+            </w:rPr>
+            <w:t xml:space="preserve"> lo tanto, se solicita la actualización al nuevo título definitivo</w:t>
+          </w:r>
+          <w:r>
+            <w:rPr>
+              <w:rStyle w:val="Estilo1"/>
+            </w:rPr>
+            <w:t>:</w:t>
+          </w:r>
+          <w:r>
+            <w:rPr>
+              <w:rStyle w:val="Estilo1"/>
+            </w:rPr>
+            <w:t xml:space="preserve"> "Detección de Fraude en Tarjetas de Crédito: Un Enfoque Metodológico Robusto mediante Gestión del Desbalance y </w:t>
+          </w:r>
+          <w:proofErr w:type="spellStart"/>
+          <w:r>
+            <w:rPr>
+              <w:rStyle w:val="Estilo1"/>
+            </w:rPr>
+            <w:t>Explicabilidad</w:t>
+          </w:r>
+          <w:proofErr w:type="spellEnd"/>
+          <w:r>
+            <w:rPr>
+              <w:rStyle w:val="Estilo1"/>
+            </w:rPr>
+            <w:t xml:space="preserve"> (XAI)" , dado que este acota, precisa y refleja con total fidelidad la naturaleza técnica y las contribuciones metodológicas reales de la memoria final que se va a depositar."</w:t>
           </w:r>
         </w:sdtContent>
       </w:sdt>
@@ -532,6 +531,18 @@
           <w:lang w:eastAsia="es-ES"/>
         </w:rPr>
       </w:pPr>
+      <w:r>
+        <w:rPr>
+          <w:lang w:eastAsia="es-ES"/>
+        </w:rPr>
+        <w:t>Firmado:</w:t>
+      </w:r>
+      <w:r>
+        <w:rPr>
+          <w:lang w:eastAsia="es-ES"/>
+        </w:rPr>
+        <w:t xml:space="preserve"> SERGIO MOYA MARÍN</w:t>
+      </w:r>
     </w:p>
     <w:p>
       <w:pPr>
@@ -539,22 +550,62 @@
           <w:lang w:eastAsia="es-ES"/>
         </w:rPr>
       </w:pPr>
-    </w:p>
-    <w:p>
-      <w:pPr>
-        <w:rPr>
-          <w:lang w:eastAsia="es-ES"/>
-        </w:rPr>
-      </w:pPr>
-      <w:r>
-        <w:rPr>
-          <w:lang w:eastAsia="es-ES"/>
-        </w:rPr>
-        <w:t>Firmado:</w:t>
+      <w:r>
+        <w:rPr>
+          <w:noProof/>
+        </w:rPr>
+        <w:drawing>
+          <wp:inline distT="0" distB="0" distL="0" distR="0" wp14:anchorId="5BC8C8FB" wp14:editId="29843A3D">
+            <wp:extent cx="1744980" cy="1309556"/>
+            <wp:effectExtent l="0" t="0" r="0" b="5080"/>
+            <wp:docPr id="1117581083" name="Imagen 1"/>
+            <wp:cNvGraphicFramePr>
+              <a:graphicFrameLocks xmlns:a="http://schemas.openxmlformats.org/drawingml/2006/main" noChangeAspect="1"/>
+            </wp:cNvGraphicFramePr>
+            <a:graphic xmlns:a="http://schemas.openxmlformats.org/drawingml/2006/main">
+              <a:graphicData uri="http://schemas.openxmlformats.org/drawingml/2006/picture">
+                <pic:pic xmlns:pic="http://schemas.openxmlformats.org/drawingml/2006/picture">
+                  <pic:nvPicPr>
+                    <pic:cNvPr id="0" name="Picture 1"/>
+                    <pic:cNvPicPr>
+                      <a:picLocks noChangeAspect="1" noChangeArrowheads="1"/>
+                    </pic:cNvPicPr>
+                  </pic:nvPicPr>
+                  <pic:blipFill>
+                    <a:blip r:embed="rId10" cstate="print">
+                      <a:extLst>
+                        <a:ext uri="{28A0092B-C50C-407E-A947-70E740481C1C}">
+                          <a14:useLocalDpi xmlns:a14="http://schemas.microsoft.com/office/drawing/2010/main" val="0"/>
+                        </a:ext>
+                      </a:extLst>
+                    </a:blip>
+                    <a:srcRect/>
+                    <a:stretch>
+                      <a:fillRect/>
+                    </a:stretch>
+                  </pic:blipFill>
+                  <pic:spPr bwMode="auto">
+                    <a:xfrm>
+                      <a:off x="0" y="0"/>
+                      <a:ext cx="1750856" cy="1313966"/>
+                    </a:xfrm>
+                    <a:prstGeom prst="rect">
+                      <a:avLst/>
+                    </a:prstGeom>
+                    <a:noFill/>
+                    <a:ln>
+                      <a:noFill/>
+                    </a:ln>
+                  </pic:spPr>
+                </pic:pic>
+              </a:graphicData>
+            </a:graphic>
+          </wp:inline>
+        </w:drawing>
       </w:r>
     </w:p>
     <w:sectPr>
-      <w:footerReference w:type="default" r:id="rId10"/>
+      <w:footerReference w:type="default" r:id="rId11"/>
       <w:pgSz w:w="11906" w:h="16838"/>
       <w:pgMar w:top="851" w:right="1701" w:bottom="1417" w:left="1701" w:header="708" w:footer="708" w:gutter="0"/>
       <w:cols w:space="708"/>
@@ -1324,7 +1375,7 @@
       <w:lang w:eastAsia="es-ES"/>
     </w:rPr>
   </w:style>
-  <w:style w:type="character" w:styleId="Textoennegrita">
+  <w:style w:type="character" w:styleId="Fuerte">
     <w:name w:val="Strong"/>
     <w:basedOn w:val="Fuentedeprrafopredeter"/>
     <w:uiPriority w:val="22"/>
@@ -1397,6 +1448,29 @@
     <w:rPr>
       <w:rFonts w:ascii="Visuelt Pro Light" w:hAnsi="Visuelt Pro Light"/>
       <w:sz w:val="20"/>
+    </w:rPr>
+  </w:style>
+  <w:style w:type="character" w:styleId="Hipervnculo">
+    <w:name w:val="Hyperlink"/>
+    <w:basedOn w:val="Fuentedeprrafopredeter"/>
+    <w:uiPriority w:val="99"/>
+    <w:unhideWhenUsed/>
+    <w:rsid w:val="000F311D"/>
+    <w:rPr>
+      <w:color w:val="0563C1" w:themeColor="hyperlink"/>
+      <w:u w:val="single"/>
+    </w:rPr>
+  </w:style>
+  <w:style w:type="character" w:styleId="Mencinsinresolver">
+    <w:name w:val="Unresolved Mention"/>
+    <w:basedOn w:val="Fuentedeprrafopredeter"/>
+    <w:uiPriority w:val="99"/>
+    <w:semiHidden/>
+    <w:unhideWhenUsed/>
+    <w:rsid w:val="000F311D"/>
+    <w:rPr>
+      <w:color w:val="605E5C"/>
+      <w:shd w:val="clear" w:color="auto" w:fill="E1DFDD"/>
     </w:rPr>
   </w:style>
 </w:styles>
@@ -1637,7 +1711,6 @@
     <w:sig w:usb0="A00002AF" w:usb1="5000205B" w:usb2="00000000" w:usb3="00000000" w:csb0="0000019F" w:csb1="00000000"/>
   </w:font>
   <w:font w:name="Arial">
-    <w:altName w:val="Arial"/>
     <w:panose1 w:val="020B0604020202020204"/>
     <w:charset w:val="00"/>
     <w:family w:val="swiss"/>
@@ -1693,8 +1766,10 @@
   </w:compat>
   <w:rsids>
     <w:rsidRoot w:val="00653F82"/>
+    <w:rsid w:val="00291DF8"/>
     <w:rsid w:val="002A1BF8"/>
     <w:rsid w:val="00653F82"/>
+    <w:rsid w:val="00B96D36"/>
     <w:rsid w:val="00C47F2C"/>
     <w:rsid w:val="00EB78BE"/>
   </w:rsids>
@@ -2451,43 +2526,6 @@
 </file>
 
 <file path=customXml/item1.xml><?xml version="1.0" encoding="utf-8"?>
-<?mso-contentType ?>
-<FormTemplates xmlns="http://schemas.microsoft.com/sharepoint/v3/contenttype/forms">
-  <Display>DocumentLibraryForm</Display>
-  <Edit>DocumentLibraryForm</Edit>
-  <New>DocumentLibraryForm</New>
-</FormTemplates>
-</file>
-
-<file path=customXml/item2.xml><?xml version="1.0" encoding="utf-8"?>
-<p:properties xmlns:p="http://schemas.microsoft.com/office/2006/metadata/properties" xmlns:xsi="http://www.w3.org/2001/XMLSchema-instance" xmlns:pc="http://schemas.microsoft.com/office/infopath/2007/PartnerControls">
-  <documentManagement>
-    <GDDescripcion xmlns="ef848eef-985f-4e5f-af94-9b10d2c40a72" xsi:nil="true"/>
-    <N_x00ba_versi_x00f3_n xmlns="17bdaf06-e97e-4c95-a053-70575cfc447b">2</N_x00ba_versi_x00f3_n>
-    <Tipo_x0020_de_x0020_Servicio xmlns="ef848eef-985f-4e5f-af94-9b10d2c40a72" xsi:nil="true"/>
-    <WEB xmlns="17bdaf06-e97e-4c95-a053-70575cfc447b">false</WEB>
-    <Evaluación xmlns="ef848eef-985f-4e5f-af94-9b10d2c40a72" xsi:nil="true"/>
-    <VIGENTE0 xmlns="17bdaf06-e97e-4c95-a053-70575cfc447b">SI</VIGENTE0>
-    <Motivobaja xmlns="17bdaf06-e97e-4c95-a053-70575cfc447b">Se genera una nueva versión para no dar lugar a confusión al estudiantado si lee que hay 2 modalidades de TFT evitando así posibles incidencias.</Motivobaja>
-    <Fechabaja xmlns="17bdaf06-e97e-4c95-a053-70575cfc447b" xsi:nil="true"/>
-    <Responsable_x0020_ xmlns="ef848eef-985f-4e5f-af94-9b10d2c40a72" xsi:nil="true"/>
-    <Fechaalta xmlns="17bdaf06-e97e-4c95-a053-70575cfc447b">2025-05-28T07:00:00+00:00</Fechaalta>
-    <TIPODOC xmlns="17bdaf06-e97e-4c95-a053-70575cfc447b">Formato</TIPODOC>
-    <_x00da_ltimarevisi_x00f3_n xmlns="17bdaf06-e97e-4c95-a053-70575cfc447b" xsi:nil="true"/>
-    <N_x00ba__x0020_de_x0020_Incidencias_x0020_ xmlns="ef848eef-985f-4e5f-af94-9b10d2c40a72" xsi:nil="true"/>
-    <GDAsuntoF3 xmlns="ef848eef-985f-4e5f-af94-9b10d2c40a72" xsi:nil="true"/>
-    <Homologado_x0020_por xmlns="ef848eef-985f-4e5f-af94-9b10d2c40a72" xsi:nil="true"/>
-    <Vigente xmlns="ef848eef-985f-4e5f-af94-9b10d2c40a72">true</Vigente>
-    <PROCESO xmlns="17bdaf06-e97e-4c95-a053-70575cfc447b">P11_ DESARROLLO DOCENCIA</PROCESO>
-    <Fecha_x0020_Firma xmlns="ef848eef-985f-4e5f-af94-9b10d2c40a72" xsi:nil="true"/>
-    <GDTipoDoc xmlns="ef848eef-985f-4e5f-af94-9b10d2c40a72" xsi:nil="true"/>
-    <GDUBFisica xmlns="ef848eef-985f-4e5f-af94-9b10d2c40a72" xsi:nil="true"/>
-    <AYUDAPDI xmlns="17bdaf06-e97e-4c95-a053-70575cfc447b">false</AYUDAPDI>
-  </documentManagement>
-</p:properties>
-</file>
-
-<file path=customXml/item3.xml><?xml version="1.0" encoding="utf-8"?>
 <ct:contentTypeSchema xmlns:ct="http://schemas.microsoft.com/office/2006/metadata/contentType" xmlns:ma="http://schemas.microsoft.com/office/2006/metadata/properties/metaAttributes" ct:_="" ma:_="" ma:contentTypeName="VIU" ma:contentTypeID="0x0101001F78872F1579B14E90DA3A6EEDE63FFE0018510EEED1C50C49AD0F3D3BCEAAFC3C" ma:contentTypeVersion="26" ma:contentTypeDescription="" ma:contentTypeScope="" ma:versionID="d0b27130e95aaa99b0c356f807fd553b">
   <xsd:schema xmlns:xsd="http://www.w3.org/2001/XMLSchema" xmlns:xs="http://www.w3.org/2001/XMLSchema" xmlns:p="http://schemas.microsoft.com/office/2006/metadata/properties" xmlns:ns2="ef848eef-985f-4e5f-af94-9b10d2c40a72" xmlns:ns3="17bdaf06-e97e-4c95-a053-70575cfc447b" targetNamespace="http://schemas.microsoft.com/office/2006/metadata/properties" ma:root="true" ma:fieldsID="15aeb2f0f67f5185a412b0c5958713dc" ns2:_="" ns3:_="">
     <xsd:import namespace="ef848eef-985f-4e5f-af94-9b10d2c40a72"/>
@@ -2931,10 +2969,58 @@
 </ct:contentTypeSchema>
 </file>
 
+<file path=customXml/item2.xml><?xml version="1.0" encoding="utf-8"?>
+<p:properties xmlns:p="http://schemas.microsoft.com/office/2006/metadata/properties" xmlns:xsi="http://www.w3.org/2001/XMLSchema-instance" xmlns:pc="http://schemas.microsoft.com/office/infopath/2007/PartnerControls">
+  <documentManagement>
+    <GDDescripcion xmlns="ef848eef-985f-4e5f-af94-9b10d2c40a72" xsi:nil="true"/>
+    <N_x00ba_versi_x00f3_n xmlns="17bdaf06-e97e-4c95-a053-70575cfc447b">2</N_x00ba_versi_x00f3_n>
+    <Tipo_x0020_de_x0020_Servicio xmlns="ef848eef-985f-4e5f-af94-9b10d2c40a72" xsi:nil="true"/>
+    <WEB xmlns="17bdaf06-e97e-4c95-a053-70575cfc447b">false</WEB>
+    <Evaluación xmlns="ef848eef-985f-4e5f-af94-9b10d2c40a72" xsi:nil="true"/>
+    <VIGENTE0 xmlns="17bdaf06-e97e-4c95-a053-70575cfc447b">SI</VIGENTE0>
+    <Motivobaja xmlns="17bdaf06-e97e-4c95-a053-70575cfc447b">Se genera una nueva versión para no dar lugar a confusión al estudiantado si lee que hay 2 modalidades de TFT evitando así posibles incidencias.</Motivobaja>
+    <Fechabaja xmlns="17bdaf06-e97e-4c95-a053-70575cfc447b" xsi:nil="true"/>
+    <Responsable_x0020_ xmlns="ef848eef-985f-4e5f-af94-9b10d2c40a72" xsi:nil="true"/>
+    <Fechaalta xmlns="17bdaf06-e97e-4c95-a053-70575cfc447b">2025-05-28T07:00:00+00:00</Fechaalta>
+    <TIPODOC xmlns="17bdaf06-e97e-4c95-a053-70575cfc447b">Formato</TIPODOC>
+    <_x00da_ltimarevisi_x00f3_n xmlns="17bdaf06-e97e-4c95-a053-70575cfc447b" xsi:nil="true"/>
+    <N_x00ba__x0020_de_x0020_Incidencias_x0020_ xmlns="ef848eef-985f-4e5f-af94-9b10d2c40a72" xsi:nil="true"/>
+    <GDAsuntoF3 xmlns="ef848eef-985f-4e5f-af94-9b10d2c40a72" xsi:nil="true"/>
+    <Homologado_x0020_por xmlns="ef848eef-985f-4e5f-af94-9b10d2c40a72" xsi:nil="true"/>
+    <Vigente xmlns="ef848eef-985f-4e5f-af94-9b10d2c40a72">true</Vigente>
+    <PROCESO xmlns="17bdaf06-e97e-4c95-a053-70575cfc447b">P11_ DESARROLLO DOCENCIA</PROCESO>
+    <Fecha_x0020_Firma xmlns="ef848eef-985f-4e5f-af94-9b10d2c40a72" xsi:nil="true"/>
+    <GDTipoDoc xmlns="ef848eef-985f-4e5f-af94-9b10d2c40a72" xsi:nil="true"/>
+    <GDUBFisica xmlns="ef848eef-985f-4e5f-af94-9b10d2c40a72" xsi:nil="true"/>
+    <AYUDAPDI xmlns="17bdaf06-e97e-4c95-a053-70575cfc447b">false</AYUDAPDI>
+  </documentManagement>
+</p:properties>
+</file>
+
+<file path=customXml/item3.xml><?xml version="1.0" encoding="utf-8"?>
+<?mso-contentType ?>
+<FormTemplates xmlns="http://schemas.microsoft.com/sharepoint/v3/contenttype/forms">
+  <Display>DocumentLibraryForm</Display>
+  <Edit>DocumentLibraryForm</Edit>
+  <New>DocumentLibraryForm</New>
+</FormTemplates>
+</file>
+
 <file path=customXml/itemProps1.xml><?xml version="1.0" encoding="utf-8"?>
-<ds:datastoreItem xmlns:ds="http://schemas.openxmlformats.org/officeDocument/2006/customXml" ds:itemID="{99BABD5F-B04F-436A-A26B-9EF38A8461C0}">
+<ds:datastoreItem xmlns:ds="http://schemas.openxmlformats.org/officeDocument/2006/customXml" ds:itemID="{BC2BF535-FC43-4EBA-8E25-D96E048F1F39}">
   <ds:schemaRefs>
-    <ds:schemaRef ds:uri="http://schemas.microsoft.com/sharepoint/v3/contenttype/forms"/>
+    <ds:schemaRef ds:uri="http://schemas.microsoft.com/office/2006/metadata/contentType"/>
+    <ds:schemaRef ds:uri="http://schemas.microsoft.com/office/2006/metadata/properties/metaAttributes"/>
+    <ds:schemaRef ds:uri="http://www.w3.org/2001/XMLSchema"/>
+    <ds:schemaRef ds:uri="http://schemas.microsoft.com/office/2006/metadata/properties"/>
+    <ds:schemaRef ds:uri="ef848eef-985f-4e5f-af94-9b10d2c40a72"/>
+    <ds:schemaRef ds:uri="17bdaf06-e97e-4c95-a053-70575cfc447b"/>
+    <ds:schemaRef ds:uri="http://schemas.microsoft.com/office/2006/documentManagement/types"/>
+    <ds:schemaRef ds:uri="http://schemas.microsoft.com/office/infopath/2007/PartnerControls"/>
+    <ds:schemaRef ds:uri="http://schemas.openxmlformats.org/package/2006/metadata/core-properties"/>
+    <ds:schemaRef ds:uri="http://purl.org/dc/elements/1.1/"/>
+    <ds:schemaRef ds:uri="http://purl.org/dc/terms/"/>
+    <ds:schemaRef ds:uri="http://schemas.microsoft.com/internal/obd"/>
   </ds:schemaRefs>
 </ds:datastoreItem>
 </file>
@@ -2951,20 +3037,9 @@
 </file>
 
 <file path=customXml/itemProps3.xml><?xml version="1.0" encoding="utf-8"?>
-<ds:datastoreItem xmlns:ds="http://schemas.openxmlformats.org/officeDocument/2006/customXml" ds:itemID="{BC2BF535-FC43-4EBA-8E25-D96E048F1F39}">
+<ds:datastoreItem xmlns:ds="http://schemas.openxmlformats.org/officeDocument/2006/customXml" ds:itemID="{99BABD5F-B04F-436A-A26B-9EF38A8461C0}">
   <ds:schemaRefs>
-    <ds:schemaRef ds:uri="http://schemas.microsoft.com/office/2006/metadata/contentType"/>
-    <ds:schemaRef ds:uri="http://schemas.microsoft.com/office/2006/metadata/properties/metaAttributes"/>
-    <ds:schemaRef ds:uri="http://www.w3.org/2001/XMLSchema"/>
-    <ds:schemaRef ds:uri="http://schemas.microsoft.com/office/2006/metadata/properties"/>
-    <ds:schemaRef ds:uri="ef848eef-985f-4e5f-af94-9b10d2c40a72"/>
-    <ds:schemaRef ds:uri="17bdaf06-e97e-4c95-a053-70575cfc447b"/>
-    <ds:schemaRef ds:uri="http://schemas.microsoft.com/office/2006/documentManagement/types"/>
-    <ds:schemaRef ds:uri="http://schemas.microsoft.com/office/infopath/2007/PartnerControls"/>
-    <ds:schemaRef ds:uri="http://schemas.openxmlformats.org/package/2006/metadata/core-properties"/>
-    <ds:schemaRef ds:uri="http://purl.org/dc/elements/1.1/"/>
-    <ds:schemaRef ds:uri="http://purl.org/dc/terms/"/>
-    <ds:schemaRef ds:uri="http://schemas.microsoft.com/internal/obd"/>
+    <ds:schemaRef ds:uri="http://schemas.microsoft.com/sharepoint/v3/contenttype/forms"/>
   </ds:schemaRefs>
 </ds:datastoreItem>
 </file>
</xml_diff>